<commit_message>
Nội dung 2: human judge (chấm tay 36 câu trả lời, agreement với judge, báo cáo mục 8.5)
- human_judge.py + human_judge_template.html: phiếu chấm mù (18 câu hỏi stratified x 2 hệ), tính % agreement và Cohen's κ
- testset/human_judge/: phiếu chấm, key, nhãn human judge; results/human_judge/: kết quả so với llama3.1:8b
- Bao_cao_Y2: thêm mục 8.5 Đối chiếu với human judge (Bảng 10, 11)
- README: kết quả human judge, cấu trúc repo
</commit_message>
<xml_diff>
--- a/report/Bao_cao_Y2.docx
+++ b/report/Bao_cao_Y2.docx
@@ -6035,6 +6035,1756 @@
     </w:p>
     <w:p>
       <w:pPr>
+        <w:pStyle w:val="Heading2"/>
+      </w:pPr>
+      <w:r>
+        <w:t>8.5. Đối chiếu với human judge</w:t>
+      </w:r>
+    </w:p>
+    <w:p>
+      <w:pPr>
+        <w:ind w:firstLine="567"/>
+      </w:pPr>
+      <w:r>
+        <w:t>Để kiểm tra độ tin cậy của judge, một mẫu stratified gồm 18 câu hỏi (9 single-hop, 9 multi-hop, chọn ngẫu nhiên với seed 42) được chấm tay; mỗi câu hỏi chấm câu trả lời của cả hai hệ, tổng 36 câu trả lời. Phiếu chấm xáo trộn thứ tự, không ghi tên hệ thống và không hiện điểm của judge. Human judge gán đúng ba loại nhãn mà judge gán, trên đúng dữ liệu judge đã chấm: passage có giúp suy ra ground truth không (retrieval precision), từng claim do judge tách từ câu trả lời có được context hỗ trợ không (faithfulness, hallucination), và câu trả lời có đúng so với ground truth không (answer correctness). Nhãn được so với điểm judge gốc (Bảng 7) bằng % agreement và Cohen's κ, CI 95% bootstrap theo câu trả lời.</w:t>
+      </w:r>
+    </w:p>
+    <w:p>
+      <w:pPr>
+        <w:pStyle w:val="Caption"/>
+        <w:keepNext/>
+        <w:jc w:val="center"/>
+      </w:pPr>
+      <w:r>
+        <w:t>Bảng 10. Agreement giữa human judge và judge (llama3.1:8b) trên mẫu stratified</w:t>
+      </w:r>
+    </w:p>
+    <w:tbl>
+      <w:tblPr>
+        <w:tblStyle w:val="TableGrid"/>
+        <w:tblW w:type="auto" w:w="0"/>
+        <w:jc w:val="center"/>
+        <w:tblLayout w:type="fixed"/>
+        <w:tblLook w:firstColumn="1" w:firstRow="1" w:lastColumn="0" w:lastRow="0" w:noHBand="0" w:noVBand="1" w:val="04A0"/>
+      </w:tblPr>
+      <w:tblGrid>
+        <w:gridCol w:w="1296"/>
+        <w:gridCol w:w="1296"/>
+        <w:gridCol w:w="1296"/>
+        <w:gridCol w:w="1296"/>
+        <w:gridCol w:w="1296"/>
+        <w:gridCol w:w="1296"/>
+        <w:gridCol w:w="1296"/>
+      </w:tblGrid>
+      <w:tr>
+        <w:trPr>
+          <w:tblHeader w:val="true"/>
+          <w:cantSplit w:val="true"/>
+        </w:trPr>
+        <w:tc>
+          <w:tcPr>
+            <w:tcW w:type="dxa" w:w="2041"/>
+            <w:shd w:val="clear" w:color="auto" w:fill="1C5CAB"/>
+          </w:tcPr>
+          <w:p>
+            <w:pPr>
+              <w:spacing w:after="20" w:line="264" w:lineRule="auto"/>
+              <w:jc w:val="center"/>
+            </w:pPr>
+            <w:r/>
+            <w:r>
+              <w:rPr>
+                <w:b/>
+                <w:color w:val="FFFFFF"/>
+                <w:sz w:val="20"/>
+              </w:rPr>
+              <w:t>Nhãn</w:t>
+            </w:r>
+          </w:p>
+        </w:tc>
+        <w:tc>
+          <w:tcPr>
+            <w:tcW w:type="dxa" w:w="794"/>
+            <w:shd w:val="clear" w:color="auto" w:fill="1C5CAB"/>
+          </w:tcPr>
+          <w:p>
+            <w:pPr>
+              <w:spacing w:after="20" w:line="264" w:lineRule="auto"/>
+              <w:jc w:val="center"/>
+            </w:pPr>
+            <w:r/>
+            <w:r>
+              <w:rPr>
+                <w:b/>
+                <w:color w:val="FFFFFF"/>
+                <w:sz w:val="20"/>
+              </w:rPr>
+              <w:t>Số nhãn</w:t>
+            </w:r>
+          </w:p>
+        </w:tc>
+        <w:tc>
+          <w:tcPr>
+            <w:tcW w:type="dxa" w:w="1020"/>
+            <w:shd w:val="clear" w:color="auto" w:fill="1C5CAB"/>
+          </w:tcPr>
+          <w:p>
+            <w:pPr>
+              <w:spacing w:after="20" w:line="264" w:lineRule="auto"/>
+              <w:jc w:val="center"/>
+            </w:pPr>
+            <w:r/>
+            <w:r>
+              <w:rPr>
+                <w:b/>
+                <w:color w:val="FFFFFF"/>
+                <w:sz w:val="20"/>
+              </w:rPr>
+              <w:t>Tỉ lệ "có": human</w:t>
+            </w:r>
+          </w:p>
+        </w:tc>
+        <w:tc>
+          <w:tcPr>
+            <w:tcW w:type="dxa" w:w="1020"/>
+            <w:shd w:val="clear" w:color="auto" w:fill="1C5CAB"/>
+          </w:tcPr>
+          <w:p>
+            <w:pPr>
+              <w:spacing w:after="20" w:line="264" w:lineRule="auto"/>
+              <w:jc w:val="center"/>
+            </w:pPr>
+            <w:r/>
+            <w:r>
+              <w:rPr>
+                <w:b/>
+                <w:color w:val="FFFFFF"/>
+                <w:sz w:val="20"/>
+              </w:rPr>
+              <w:t>Tỉ lệ "có": judge</w:t>
+            </w:r>
+          </w:p>
+        </w:tc>
+        <w:tc>
+          <w:tcPr>
+            <w:tcW w:type="dxa" w:w="1474"/>
+            <w:shd w:val="clear" w:color="auto" w:fill="1C5CAB"/>
+          </w:tcPr>
+          <w:p>
+            <w:pPr>
+              <w:spacing w:after="20" w:line="264" w:lineRule="auto"/>
+              <w:jc w:val="center"/>
+            </w:pPr>
+            <w:r/>
+            <w:r>
+              <w:rPr>
+                <w:b/>
+                <w:color w:val="FFFFFF"/>
+                <w:sz w:val="20"/>
+              </w:rPr>
+              <w:t>% agreement [CI 95%]</w:t>
+            </w:r>
+          </w:p>
+        </w:tc>
+        <w:tc>
+          <w:tcPr>
+            <w:tcW w:type="dxa" w:w="1474"/>
+            <w:shd w:val="clear" w:color="auto" w:fill="1C5CAB"/>
+          </w:tcPr>
+          <w:p>
+            <w:pPr>
+              <w:spacing w:after="20" w:line="264" w:lineRule="auto"/>
+              <w:jc w:val="center"/>
+            </w:pPr>
+            <w:r/>
+            <w:r>
+              <w:rPr>
+                <w:b/>
+                <w:color w:val="FFFFFF"/>
+                <w:sz w:val="20"/>
+              </w:rPr>
+              <w:t>Cohen's κ [CI 95%]</w:t>
+            </w:r>
+          </w:p>
+        </w:tc>
+        <w:tc>
+          <w:tcPr>
+            <w:tcW w:type="dxa" w:w="1247"/>
+            <w:shd w:val="clear" w:color="auto" w:fill="1C5CAB"/>
+          </w:tcPr>
+          <w:p>
+            <w:pPr>
+              <w:spacing w:after="20" w:line="264" w:lineRule="auto"/>
+              <w:jc w:val="center"/>
+            </w:pPr>
+            <w:r/>
+            <w:r>
+              <w:rPr>
+                <w:b/>
+                <w:color w:val="FFFFFF"/>
+                <w:sz w:val="20"/>
+              </w:rPr>
+              <w:t>Mức (Landis &amp; Koch)</w:t>
+            </w:r>
+          </w:p>
+        </w:tc>
+      </w:tr>
+      <w:tr>
+        <w:trPr>
+          <w:cantSplit w:val="true"/>
+        </w:trPr>
+        <w:tc>
+          <w:tcPr>
+            <w:tcW w:type="dxa" w:w="2041"/>
+          </w:tcPr>
+          <w:p>
+            <w:pPr>
+              <w:spacing w:after="20" w:line="264" w:lineRule="auto"/>
+              <w:jc w:val="left"/>
+            </w:pPr>
+            <w:r>
+              <w:rPr>
+                <w:b/>
+              </w:rPr>
+            </w:r>
+            <w:r>
+              <w:rPr>
+                <w:b/>
+                <w:sz w:val="20"/>
+              </w:rPr>
+              <w:t>Passage hữu ích (retrieval precision)</w:t>
+            </w:r>
+          </w:p>
+        </w:tc>
+        <w:tc>
+          <w:tcPr>
+            <w:tcW w:type="dxa" w:w="794"/>
+          </w:tcPr>
+          <w:p>
+            <w:pPr>
+              <w:spacing w:after="20" w:line="264" w:lineRule="auto"/>
+              <w:jc w:val="center"/>
+            </w:pPr>
+            <w:r/>
+            <w:r>
+              <w:rPr>
+                <w:sz w:val="20"/>
+              </w:rPr>
+              <w:t>144</w:t>
+            </w:r>
+          </w:p>
+        </w:tc>
+        <w:tc>
+          <w:tcPr>
+            <w:tcW w:type="dxa" w:w="1020"/>
+          </w:tcPr>
+          <w:p>
+            <w:pPr>
+              <w:spacing w:after="20" w:line="264" w:lineRule="auto"/>
+              <w:jc w:val="center"/>
+            </w:pPr>
+            <w:r/>
+            <w:r>
+              <w:rPr>
+                <w:sz w:val="20"/>
+              </w:rPr>
+              <w:t>20%</w:t>
+            </w:r>
+          </w:p>
+        </w:tc>
+        <w:tc>
+          <w:tcPr>
+            <w:tcW w:type="dxa" w:w="1020"/>
+          </w:tcPr>
+          <w:p>
+            <w:pPr>
+              <w:spacing w:after="20" w:line="264" w:lineRule="auto"/>
+              <w:jc w:val="center"/>
+            </w:pPr>
+            <w:r/>
+            <w:r>
+              <w:rPr>
+                <w:sz w:val="20"/>
+              </w:rPr>
+              <w:t>51%</w:t>
+            </w:r>
+          </w:p>
+        </w:tc>
+        <w:tc>
+          <w:tcPr>
+            <w:tcW w:type="dxa" w:w="1474"/>
+          </w:tcPr>
+          <w:p>
+            <w:pPr>
+              <w:spacing w:after="20" w:line="264" w:lineRule="auto"/>
+              <w:jc w:val="center"/>
+            </w:pPr>
+            <w:r/>
+            <w:r>
+              <w:rPr>
+                <w:sz w:val="20"/>
+              </w:rPr>
+              <w:t>56%</w:t>
+              <w:br/>
+              <w:t>[46%; 66%]</w:t>
+            </w:r>
+          </w:p>
+        </w:tc>
+        <w:tc>
+          <w:tcPr>
+            <w:tcW w:type="dxa" w:w="1474"/>
+          </w:tcPr>
+          <w:p>
+            <w:pPr>
+              <w:spacing w:after="20" w:line="264" w:lineRule="auto"/>
+              <w:jc w:val="center"/>
+            </w:pPr>
+            <w:r/>
+            <w:r>
+              <w:rPr>
+                <w:sz w:val="20"/>
+              </w:rPr>
+              <w:t>0,14</w:t>
+              <w:br/>
+              <w:t>[0,00; 0,29]</w:t>
+            </w:r>
+          </w:p>
+        </w:tc>
+        <w:tc>
+          <w:tcPr>
+            <w:tcW w:type="dxa" w:w="1247"/>
+          </w:tcPr>
+          <w:p>
+            <w:pPr>
+              <w:spacing w:after="20" w:line="264" w:lineRule="auto"/>
+              <w:jc w:val="center"/>
+            </w:pPr>
+            <w:r/>
+            <w:r>
+              <w:rPr>
+                <w:sz w:val="20"/>
+              </w:rPr>
+              <w:t>rất thấp</w:t>
+            </w:r>
+          </w:p>
+        </w:tc>
+      </w:tr>
+      <w:tr>
+        <w:trPr>
+          <w:cantSplit w:val="true"/>
+        </w:trPr>
+        <w:tc>
+          <w:tcPr>
+            <w:tcW w:type="dxa" w:w="2041"/>
+            <w:shd w:val="clear" w:color="auto" w:fill="F0F5FC"/>
+          </w:tcPr>
+          <w:p>
+            <w:pPr>
+              <w:spacing w:after="20" w:line="264" w:lineRule="auto"/>
+              <w:jc w:val="left"/>
+            </w:pPr>
+            <w:r>
+              <w:rPr>
+                <w:b/>
+              </w:rPr>
+            </w:r>
+            <w:r>
+              <w:rPr>
+                <w:b/>
+                <w:sz w:val="20"/>
+              </w:rPr>
+              <w:t>Câu trả lời đúng (answer correctness)</w:t>
+            </w:r>
+          </w:p>
+        </w:tc>
+        <w:tc>
+          <w:tcPr>
+            <w:tcW w:type="dxa" w:w="794"/>
+            <w:shd w:val="clear" w:color="auto" w:fill="F0F5FC"/>
+          </w:tcPr>
+          <w:p>
+            <w:pPr>
+              <w:spacing w:after="20" w:line="264" w:lineRule="auto"/>
+              <w:jc w:val="center"/>
+            </w:pPr>
+            <w:r/>
+            <w:r>
+              <w:rPr>
+                <w:sz w:val="20"/>
+              </w:rPr>
+              <w:t>36</w:t>
+            </w:r>
+          </w:p>
+        </w:tc>
+        <w:tc>
+          <w:tcPr>
+            <w:tcW w:type="dxa" w:w="1020"/>
+            <w:shd w:val="clear" w:color="auto" w:fill="F0F5FC"/>
+          </w:tcPr>
+          <w:p>
+            <w:pPr>
+              <w:spacing w:after="20" w:line="264" w:lineRule="auto"/>
+              <w:jc w:val="center"/>
+            </w:pPr>
+            <w:r/>
+            <w:r>
+              <w:rPr>
+                <w:sz w:val="20"/>
+              </w:rPr>
+              <w:t>42%</w:t>
+            </w:r>
+          </w:p>
+        </w:tc>
+        <w:tc>
+          <w:tcPr>
+            <w:tcW w:type="dxa" w:w="1020"/>
+            <w:shd w:val="clear" w:color="auto" w:fill="F0F5FC"/>
+          </w:tcPr>
+          <w:p>
+            <w:pPr>
+              <w:spacing w:after="20" w:line="264" w:lineRule="auto"/>
+              <w:jc w:val="center"/>
+            </w:pPr>
+            <w:r/>
+            <w:r>
+              <w:rPr>
+                <w:sz w:val="20"/>
+              </w:rPr>
+              <w:t>83%</w:t>
+            </w:r>
+          </w:p>
+        </w:tc>
+        <w:tc>
+          <w:tcPr>
+            <w:tcW w:type="dxa" w:w="1474"/>
+            <w:shd w:val="clear" w:color="auto" w:fill="F0F5FC"/>
+          </w:tcPr>
+          <w:p>
+            <w:pPr>
+              <w:spacing w:after="20" w:line="264" w:lineRule="auto"/>
+              <w:jc w:val="center"/>
+            </w:pPr>
+            <w:r/>
+            <w:r>
+              <w:rPr>
+                <w:sz w:val="20"/>
+              </w:rPr>
+              <w:t>53%</w:t>
+              <w:br/>
+              <w:t>[36%; 69%]</w:t>
+            </w:r>
+          </w:p>
+        </w:tc>
+        <w:tc>
+          <w:tcPr>
+            <w:tcW w:type="dxa" w:w="1474"/>
+            <w:shd w:val="clear" w:color="auto" w:fill="F0F5FC"/>
+          </w:tcPr>
+          <w:p>
+            <w:pPr>
+              <w:spacing w:after="20" w:line="264" w:lineRule="auto"/>
+              <w:jc w:val="center"/>
+            </w:pPr>
+            <w:r/>
+            <w:r>
+              <w:rPr>
+                <w:sz w:val="20"/>
+              </w:rPr>
+              <w:t>0,15</w:t>
+              <w:br/>
+              <w:t>[−0,06; 0,37]</w:t>
+            </w:r>
+          </w:p>
+        </w:tc>
+        <w:tc>
+          <w:tcPr>
+            <w:tcW w:type="dxa" w:w="1247"/>
+            <w:shd w:val="clear" w:color="auto" w:fill="F0F5FC"/>
+          </w:tcPr>
+          <w:p>
+            <w:pPr>
+              <w:spacing w:after="20" w:line="264" w:lineRule="auto"/>
+              <w:jc w:val="center"/>
+            </w:pPr>
+            <w:r/>
+            <w:r>
+              <w:rPr>
+                <w:sz w:val="20"/>
+              </w:rPr>
+              <w:t>rất thấp</w:t>
+            </w:r>
+          </w:p>
+        </w:tc>
+      </w:tr>
+      <w:tr>
+        <w:trPr>
+          <w:cantSplit w:val="true"/>
+        </w:trPr>
+        <w:tc>
+          <w:tcPr>
+            <w:tcW w:type="dxa" w:w="2041"/>
+          </w:tcPr>
+          <w:p>
+            <w:pPr>
+              <w:spacing w:after="20" w:line="264" w:lineRule="auto"/>
+              <w:jc w:val="left"/>
+            </w:pPr>
+            <w:r>
+              <w:rPr>
+                <w:b/>
+              </w:rPr>
+            </w:r>
+            <w:r>
+              <w:rPr>
+                <w:b/>
+                <w:sz w:val="20"/>
+              </w:rPr>
+              <w:t>Có ý không được hỗ trợ (hallucination)</w:t>
+            </w:r>
+          </w:p>
+        </w:tc>
+        <w:tc>
+          <w:tcPr>
+            <w:tcW w:type="dxa" w:w="794"/>
+          </w:tcPr>
+          <w:p>
+            <w:pPr>
+              <w:spacing w:after="20" w:line="264" w:lineRule="auto"/>
+              <w:jc w:val="center"/>
+            </w:pPr>
+            <w:r/>
+            <w:r>
+              <w:rPr>
+                <w:sz w:val="20"/>
+              </w:rPr>
+              <w:t>32</w:t>
+            </w:r>
+          </w:p>
+        </w:tc>
+        <w:tc>
+          <w:tcPr>
+            <w:tcW w:type="dxa" w:w="1020"/>
+          </w:tcPr>
+          <w:p>
+            <w:pPr>
+              <w:spacing w:after="20" w:line="264" w:lineRule="auto"/>
+              <w:jc w:val="center"/>
+            </w:pPr>
+            <w:r/>
+            <w:r>
+              <w:rPr>
+                <w:sz w:val="20"/>
+              </w:rPr>
+              <w:t>16%</w:t>
+            </w:r>
+          </w:p>
+        </w:tc>
+        <w:tc>
+          <w:tcPr>
+            <w:tcW w:type="dxa" w:w="1020"/>
+          </w:tcPr>
+          <w:p>
+            <w:pPr>
+              <w:spacing w:after="20" w:line="264" w:lineRule="auto"/>
+              <w:jc w:val="center"/>
+            </w:pPr>
+            <w:r/>
+            <w:r>
+              <w:rPr>
+                <w:sz w:val="20"/>
+              </w:rPr>
+              <w:t>53%</w:t>
+            </w:r>
+          </w:p>
+        </w:tc>
+        <w:tc>
+          <w:tcPr>
+            <w:tcW w:type="dxa" w:w="1474"/>
+          </w:tcPr>
+          <w:p>
+            <w:pPr>
+              <w:spacing w:after="20" w:line="264" w:lineRule="auto"/>
+              <w:jc w:val="center"/>
+            </w:pPr>
+            <w:r/>
+            <w:r>
+              <w:rPr>
+                <w:sz w:val="20"/>
+              </w:rPr>
+              <w:t>62%</w:t>
+              <w:br/>
+              <w:t>[47%; 78%]</w:t>
+            </w:r>
+          </w:p>
+        </w:tc>
+        <w:tc>
+          <w:tcPr>
+            <w:tcW w:type="dxa" w:w="1474"/>
+          </w:tcPr>
+          <w:p>
+            <w:pPr>
+              <w:spacing w:after="20" w:line="264" w:lineRule="auto"/>
+              <w:jc w:val="center"/>
+            </w:pPr>
+            <w:r/>
+            <w:r>
+              <w:rPr>
+                <w:sz w:val="20"/>
+              </w:rPr>
+              <w:t>0,28</w:t>
+              <w:br/>
+              <w:t>[0,08; 0,55]</w:t>
+            </w:r>
+          </w:p>
+        </w:tc>
+        <w:tc>
+          <w:tcPr>
+            <w:tcW w:type="dxa" w:w="1247"/>
+          </w:tcPr>
+          <w:p>
+            <w:pPr>
+              <w:spacing w:after="20" w:line="264" w:lineRule="auto"/>
+              <w:jc w:val="center"/>
+            </w:pPr>
+            <w:r/>
+            <w:r>
+              <w:rPr>
+                <w:sz w:val="20"/>
+              </w:rPr>
+              <w:t>thấp</w:t>
+            </w:r>
+          </w:p>
+        </w:tc>
+      </w:tr>
+    </w:tbl>
+    <w:p>
+      <w:pPr>
+        <w:spacing w:after="40"/>
+      </w:pPr>
+    </w:p>
+    <w:p>
+      <w:pPr>
+        <w:ind w:firstLine="567"/>
+      </w:pPr>
+      <w:r>
+        <w:t>Agreement giữa human judge và judge thấp: κ từ 0,14 đến 0,28, tức mức rất thấp đến thấp theo Landis &amp; Koch. Sai lệch có hướng rõ và ngược chiều nhau giữa các prompt: ở bước chấm passage và answer correctness, judge dễ dãi hơn (tính 51% passage là hữu ích so với 20% của human judge; 83% câu trả lời là đúng so với 42%), còn ở bước verify claim judge khắt khe hơn (53% câu trả lời có claim không được hỗ trợ so với 16%; faithfulness trung bình 0,869 so với 0,962, tương quan Pearson 0,43, n = 32). Như vậy mức tuyệt đối của các metric do judge chấm (Bảng 7) không nên đọc như độ chính xác thực của hệ thống; theo nhãn human judge, answer correctness trên mẫu này thấp hơn khoảng một nửa.</w:t>
+      </w:r>
+    </w:p>
+    <w:p>
+      <w:pPr>
+        <w:pStyle w:val="Caption"/>
+        <w:keepNext/>
+        <w:jc w:val="center"/>
+      </w:pPr>
+      <w:r>
+        <w:t>Bảng 11. GraphRAG − Vector RAG trên cùng mẫu, tính bằng nhãn human judge và nhãn judge (in đậm: có statistical significance)</w:t>
+      </w:r>
+    </w:p>
+    <w:tbl>
+      <w:tblPr>
+        <w:tblStyle w:val="TableGrid"/>
+        <w:tblW w:type="auto" w:w="0"/>
+        <w:jc w:val="center"/>
+        <w:tblLayout w:type="fixed"/>
+        <w:tblLook w:firstColumn="1" w:firstRow="1" w:lastColumn="0" w:lastRow="0" w:noHBand="0" w:noVBand="1" w:val="04A0"/>
+      </w:tblPr>
+      <w:tblGrid>
+        <w:gridCol w:w="1512"/>
+        <w:gridCol w:w="1512"/>
+        <w:gridCol w:w="1512"/>
+        <w:gridCol w:w="1512"/>
+        <w:gridCol w:w="1512"/>
+        <w:gridCol w:w="1512"/>
+      </w:tblGrid>
+      <w:tr>
+        <w:trPr>
+          <w:tblHeader w:val="true"/>
+          <w:cantSplit w:val="true"/>
+        </w:trPr>
+        <w:tc>
+          <w:tcPr>
+            <w:tcW w:type="dxa" w:w="1814"/>
+            <w:shd w:val="clear" w:color="auto" w:fill="1C5CAB"/>
+          </w:tcPr>
+          <w:p>
+            <w:pPr>
+              <w:spacing w:after="20" w:line="264" w:lineRule="auto"/>
+              <w:jc w:val="center"/>
+            </w:pPr>
+            <w:r/>
+            <w:r>
+              <w:rPr>
+                <w:b/>
+                <w:color w:val="FFFFFF"/>
+                <w:sz w:val="20"/>
+              </w:rPr>
+              <w:t>Metric</w:t>
+            </w:r>
+          </w:p>
+        </w:tc>
+        <w:tc>
+          <w:tcPr>
+            <w:tcW w:type="dxa" w:w="1304"/>
+            <w:shd w:val="clear" w:color="auto" w:fill="1C5CAB"/>
+          </w:tcPr>
+          <w:p>
+            <w:pPr>
+              <w:spacing w:after="20" w:line="264" w:lineRule="auto"/>
+              <w:jc w:val="center"/>
+            </w:pPr>
+            <w:r/>
+            <w:r>
+              <w:rPr>
+                <w:b/>
+                <w:color w:val="FFFFFF"/>
+                <w:sz w:val="20"/>
+              </w:rPr>
+              <w:t>Người chấm</w:t>
+            </w:r>
+          </w:p>
+        </w:tc>
+        <w:tc>
+          <w:tcPr>
+            <w:tcW w:type="dxa" w:w="680"/>
+            <w:shd w:val="clear" w:color="auto" w:fill="1C5CAB"/>
+          </w:tcPr>
+          <w:p>
+            <w:pPr>
+              <w:spacing w:after="20" w:line="264" w:lineRule="auto"/>
+              <w:jc w:val="center"/>
+            </w:pPr>
+            <w:r/>
+            <w:r>
+              <w:rPr>
+                <w:b/>
+                <w:color w:val="FFFFFF"/>
+                <w:sz w:val="20"/>
+              </w:rPr>
+              <w:t>Số cặp</w:t>
+            </w:r>
+          </w:p>
+        </w:tc>
+        <w:tc>
+          <w:tcPr>
+            <w:tcW w:type="dxa" w:w="1247"/>
+            <w:shd w:val="clear" w:color="auto" w:fill="1C5CAB"/>
+          </w:tcPr>
+          <w:p>
+            <w:pPr>
+              <w:spacing w:after="20" w:line="264" w:lineRule="auto"/>
+              <w:jc w:val="center"/>
+            </w:pPr>
+            <w:r/>
+            <w:r>
+              <w:rPr>
+                <w:b/>
+                <w:color w:val="FFFFFF"/>
+                <w:sz w:val="20"/>
+              </w:rPr>
+              <w:t>GraphRAG</w:t>
+            </w:r>
+          </w:p>
+        </w:tc>
+        <w:tc>
+          <w:tcPr>
+            <w:tcW w:type="dxa" w:w="1247"/>
+            <w:shd w:val="clear" w:color="auto" w:fill="1C5CAB"/>
+          </w:tcPr>
+          <w:p>
+            <w:pPr>
+              <w:spacing w:after="20" w:line="264" w:lineRule="auto"/>
+              <w:jc w:val="center"/>
+            </w:pPr>
+            <w:r/>
+            <w:r>
+              <w:rPr>
+                <w:b/>
+                <w:color w:val="FFFFFF"/>
+                <w:sz w:val="20"/>
+              </w:rPr>
+              <w:t>Vector RAG</w:t>
+            </w:r>
+          </w:p>
+        </w:tc>
+        <w:tc>
+          <w:tcPr>
+            <w:tcW w:type="dxa" w:w="2778"/>
+            <w:shd w:val="clear" w:color="auto" w:fill="1C5CAB"/>
+          </w:tcPr>
+          <w:p>
+            <w:pPr>
+              <w:spacing w:after="20" w:line="264" w:lineRule="auto"/>
+              <w:jc w:val="center"/>
+            </w:pPr>
+            <w:r/>
+            <w:r>
+              <w:rPr>
+                <w:b/>
+                <w:color w:val="FFFFFF"/>
+                <w:sz w:val="20"/>
+              </w:rPr>
+              <w:t>Paired difference [CI 95%]</w:t>
+            </w:r>
+          </w:p>
+        </w:tc>
+      </w:tr>
+      <w:tr>
+        <w:trPr>
+          <w:cantSplit w:val="true"/>
+        </w:trPr>
+        <w:tc>
+          <w:tcPr>
+            <w:tcW w:type="dxa" w:w="1814"/>
+          </w:tcPr>
+          <w:p>
+            <w:pPr>
+              <w:spacing w:after="20" w:line="264" w:lineRule="auto"/>
+              <w:jc w:val="left"/>
+            </w:pPr>
+            <w:r>
+              <w:rPr>
+                <w:b/>
+              </w:rPr>
+            </w:r>
+            <w:r>
+              <w:rPr>
+                <w:b/>
+                <w:sz w:val="20"/>
+              </w:rPr>
+              <w:t>Retrieval precision</w:t>
+            </w:r>
+          </w:p>
+        </w:tc>
+        <w:tc>
+          <w:tcPr>
+            <w:tcW w:type="dxa" w:w="1304"/>
+          </w:tcPr>
+          <w:p>
+            <w:pPr>
+              <w:spacing w:after="20" w:line="264" w:lineRule="auto"/>
+              <w:jc w:val="left"/>
+            </w:pPr>
+            <w:r/>
+            <w:r>
+              <w:rPr>
+                <w:sz w:val="20"/>
+              </w:rPr>
+              <w:t>Human judge</w:t>
+            </w:r>
+          </w:p>
+        </w:tc>
+        <w:tc>
+          <w:tcPr>
+            <w:tcW w:type="dxa" w:w="680"/>
+          </w:tcPr>
+          <w:p>
+            <w:pPr>
+              <w:spacing w:after="20" w:line="264" w:lineRule="auto"/>
+              <w:jc w:val="center"/>
+            </w:pPr>
+            <w:r/>
+            <w:r>
+              <w:rPr>
+                <w:sz w:val="20"/>
+              </w:rPr>
+              <w:t>18</w:t>
+            </w:r>
+          </w:p>
+        </w:tc>
+        <w:tc>
+          <w:tcPr>
+            <w:tcW w:type="dxa" w:w="1247"/>
+          </w:tcPr>
+          <w:p>
+            <w:pPr>
+              <w:spacing w:after="20" w:line="264" w:lineRule="auto"/>
+              <w:jc w:val="center"/>
+            </w:pPr>
+            <w:r/>
+            <w:r>
+              <w:rPr>
+                <w:sz w:val="20"/>
+              </w:rPr>
+              <w:t>0,153</w:t>
+            </w:r>
+          </w:p>
+        </w:tc>
+        <w:tc>
+          <w:tcPr>
+            <w:tcW w:type="dxa" w:w="1247"/>
+          </w:tcPr>
+          <w:p>
+            <w:pPr>
+              <w:spacing w:after="20" w:line="264" w:lineRule="auto"/>
+              <w:jc w:val="center"/>
+            </w:pPr>
+            <w:r/>
+            <w:r>
+              <w:rPr>
+                <w:sz w:val="20"/>
+              </w:rPr>
+              <w:t>0,250</w:t>
+            </w:r>
+          </w:p>
+        </w:tc>
+        <w:tc>
+          <w:tcPr>
+            <w:tcW w:type="dxa" w:w="2778"/>
+          </w:tcPr>
+          <w:p>
+            <w:pPr>
+              <w:spacing w:after="20" w:line="264" w:lineRule="auto"/>
+              <w:jc w:val="center"/>
+            </w:pPr>
+            <w:r/>
+            <w:r>
+              <w:rPr>
+                <w:sz w:val="20"/>
+              </w:rPr>
+              <w:t>−0,097 [−0,208; +0,014]</w:t>
+            </w:r>
+          </w:p>
+        </w:tc>
+      </w:tr>
+      <w:tr>
+        <w:trPr>
+          <w:cantSplit w:val="true"/>
+        </w:trPr>
+        <w:tc>
+          <w:tcPr>
+            <w:tcW w:type="dxa" w:w="1814"/>
+            <w:shd w:val="clear" w:color="auto" w:fill="F0F5FC"/>
+          </w:tcPr>
+          <w:p>
+            <w:pPr>
+              <w:spacing w:after="20" w:line="264" w:lineRule="auto"/>
+              <w:jc w:val="left"/>
+            </w:pPr>
+            <w:r>
+              <w:rPr>
+                <w:b/>
+              </w:rPr>
+            </w:r>
+          </w:p>
+        </w:tc>
+        <w:tc>
+          <w:tcPr>
+            <w:tcW w:type="dxa" w:w="1304"/>
+            <w:shd w:val="clear" w:color="auto" w:fill="F0F5FC"/>
+          </w:tcPr>
+          <w:p>
+            <w:pPr>
+              <w:spacing w:after="20" w:line="264" w:lineRule="auto"/>
+              <w:jc w:val="left"/>
+            </w:pPr>
+            <w:r/>
+            <w:r>
+              <w:rPr>
+                <w:sz w:val="20"/>
+              </w:rPr>
+              <w:t>Judge</w:t>
+            </w:r>
+          </w:p>
+        </w:tc>
+        <w:tc>
+          <w:tcPr>
+            <w:tcW w:type="dxa" w:w="680"/>
+            <w:shd w:val="clear" w:color="auto" w:fill="F0F5FC"/>
+          </w:tcPr>
+          <w:p>
+            <w:pPr>
+              <w:spacing w:after="20" w:line="264" w:lineRule="auto"/>
+              <w:jc w:val="center"/>
+            </w:pPr>
+            <w:r/>
+            <w:r>
+              <w:rPr>
+                <w:sz w:val="20"/>
+              </w:rPr>
+              <w:t>18</w:t>
+            </w:r>
+          </w:p>
+        </w:tc>
+        <w:tc>
+          <w:tcPr>
+            <w:tcW w:type="dxa" w:w="1247"/>
+            <w:shd w:val="clear" w:color="auto" w:fill="F0F5FC"/>
+          </w:tcPr>
+          <w:p>
+            <w:pPr>
+              <w:spacing w:after="20" w:line="264" w:lineRule="auto"/>
+              <w:jc w:val="center"/>
+            </w:pPr>
+            <w:r/>
+            <w:r>
+              <w:rPr>
+                <w:sz w:val="20"/>
+              </w:rPr>
+              <w:t>0,514</w:t>
+            </w:r>
+          </w:p>
+        </w:tc>
+        <w:tc>
+          <w:tcPr>
+            <w:tcW w:type="dxa" w:w="1247"/>
+            <w:shd w:val="clear" w:color="auto" w:fill="F0F5FC"/>
+          </w:tcPr>
+          <w:p>
+            <w:pPr>
+              <w:spacing w:after="20" w:line="264" w:lineRule="auto"/>
+              <w:jc w:val="center"/>
+            </w:pPr>
+            <w:r/>
+            <w:r>
+              <w:rPr>
+                <w:sz w:val="20"/>
+              </w:rPr>
+              <w:t>0,514</w:t>
+            </w:r>
+          </w:p>
+        </w:tc>
+        <w:tc>
+          <w:tcPr>
+            <w:tcW w:type="dxa" w:w="2778"/>
+            <w:shd w:val="clear" w:color="auto" w:fill="F0F5FC"/>
+          </w:tcPr>
+          <w:p>
+            <w:pPr>
+              <w:spacing w:after="20" w:line="264" w:lineRule="auto"/>
+              <w:jc w:val="center"/>
+            </w:pPr>
+            <w:r/>
+            <w:r>
+              <w:rPr>
+                <w:sz w:val="20"/>
+              </w:rPr>
+              <w:t>+0,000 [−0,153; +0,153]</w:t>
+            </w:r>
+          </w:p>
+        </w:tc>
+      </w:tr>
+      <w:tr>
+        <w:trPr>
+          <w:cantSplit w:val="true"/>
+        </w:trPr>
+        <w:tc>
+          <w:tcPr>
+            <w:tcW w:type="dxa" w:w="1814"/>
+          </w:tcPr>
+          <w:p>
+            <w:pPr>
+              <w:spacing w:after="20" w:line="264" w:lineRule="auto"/>
+              <w:jc w:val="left"/>
+            </w:pPr>
+            <w:r>
+              <w:rPr>
+                <w:b/>
+              </w:rPr>
+            </w:r>
+            <w:r>
+              <w:rPr>
+                <w:b/>
+                <w:sz w:val="20"/>
+              </w:rPr>
+              <w:t>Faithfulness</w:t>
+            </w:r>
+          </w:p>
+        </w:tc>
+        <w:tc>
+          <w:tcPr>
+            <w:tcW w:type="dxa" w:w="1304"/>
+          </w:tcPr>
+          <w:p>
+            <w:pPr>
+              <w:spacing w:after="20" w:line="264" w:lineRule="auto"/>
+              <w:jc w:val="left"/>
+            </w:pPr>
+            <w:r/>
+            <w:r>
+              <w:rPr>
+                <w:sz w:val="20"/>
+              </w:rPr>
+              <w:t>Human judge</w:t>
+            </w:r>
+          </w:p>
+        </w:tc>
+        <w:tc>
+          <w:tcPr>
+            <w:tcW w:type="dxa" w:w="680"/>
+          </w:tcPr>
+          <w:p>
+            <w:pPr>
+              <w:spacing w:after="20" w:line="264" w:lineRule="auto"/>
+              <w:jc w:val="center"/>
+            </w:pPr>
+            <w:r/>
+            <w:r>
+              <w:rPr>
+                <w:sz w:val="20"/>
+              </w:rPr>
+              <w:t>15</w:t>
+            </w:r>
+          </w:p>
+        </w:tc>
+        <w:tc>
+          <w:tcPr>
+            <w:tcW w:type="dxa" w:w="1247"/>
+          </w:tcPr>
+          <w:p>
+            <w:pPr>
+              <w:spacing w:after="20" w:line="264" w:lineRule="auto"/>
+              <w:jc w:val="center"/>
+            </w:pPr>
+            <w:r/>
+            <w:r>
+              <w:rPr>
+                <w:sz w:val="20"/>
+              </w:rPr>
+              <w:t>0,990</w:t>
+            </w:r>
+          </w:p>
+        </w:tc>
+        <w:tc>
+          <w:tcPr>
+            <w:tcW w:type="dxa" w:w="1247"/>
+          </w:tcPr>
+          <w:p>
+            <w:pPr>
+              <w:spacing w:after="20" w:line="264" w:lineRule="auto"/>
+              <w:jc w:val="center"/>
+            </w:pPr>
+            <w:r/>
+            <w:r>
+              <w:rPr>
+                <w:sz w:val="20"/>
+              </w:rPr>
+              <w:t>0,928</w:t>
+            </w:r>
+          </w:p>
+        </w:tc>
+        <w:tc>
+          <w:tcPr>
+            <w:tcW w:type="dxa" w:w="2778"/>
+          </w:tcPr>
+          <w:p>
+            <w:pPr>
+              <w:spacing w:after="20" w:line="264" w:lineRule="auto"/>
+              <w:jc w:val="center"/>
+            </w:pPr>
+            <w:r/>
+            <w:r>
+              <w:rPr>
+                <w:b/>
+                <w:sz w:val="20"/>
+              </w:rPr>
+              <w:t>+0,062 [+0,010; +0,138]</w:t>
+            </w:r>
+          </w:p>
+        </w:tc>
+      </w:tr>
+      <w:tr>
+        <w:trPr>
+          <w:cantSplit w:val="true"/>
+        </w:trPr>
+        <w:tc>
+          <w:tcPr>
+            <w:tcW w:type="dxa" w:w="1814"/>
+            <w:shd w:val="clear" w:color="auto" w:fill="F0F5FC"/>
+          </w:tcPr>
+          <w:p>
+            <w:pPr>
+              <w:spacing w:after="20" w:line="264" w:lineRule="auto"/>
+              <w:jc w:val="left"/>
+            </w:pPr>
+            <w:r>
+              <w:rPr>
+                <w:b/>
+              </w:rPr>
+            </w:r>
+          </w:p>
+        </w:tc>
+        <w:tc>
+          <w:tcPr>
+            <w:tcW w:type="dxa" w:w="1304"/>
+            <w:shd w:val="clear" w:color="auto" w:fill="F0F5FC"/>
+          </w:tcPr>
+          <w:p>
+            <w:pPr>
+              <w:spacing w:after="20" w:line="264" w:lineRule="auto"/>
+              <w:jc w:val="left"/>
+            </w:pPr>
+            <w:r/>
+            <w:r>
+              <w:rPr>
+                <w:sz w:val="20"/>
+              </w:rPr>
+              <w:t>Judge</w:t>
+            </w:r>
+          </w:p>
+        </w:tc>
+        <w:tc>
+          <w:tcPr>
+            <w:tcW w:type="dxa" w:w="680"/>
+            <w:shd w:val="clear" w:color="auto" w:fill="F0F5FC"/>
+          </w:tcPr>
+          <w:p>
+            <w:pPr>
+              <w:spacing w:after="20" w:line="264" w:lineRule="auto"/>
+              <w:jc w:val="center"/>
+            </w:pPr>
+            <w:r/>
+            <w:r>
+              <w:rPr>
+                <w:sz w:val="20"/>
+              </w:rPr>
+              <w:t>15</w:t>
+            </w:r>
+          </w:p>
+        </w:tc>
+        <w:tc>
+          <w:tcPr>
+            <w:tcW w:type="dxa" w:w="1247"/>
+            <w:shd w:val="clear" w:color="auto" w:fill="F0F5FC"/>
+          </w:tcPr>
+          <w:p>
+            <w:pPr>
+              <w:spacing w:after="20" w:line="264" w:lineRule="auto"/>
+              <w:jc w:val="center"/>
+            </w:pPr>
+            <w:r/>
+            <w:r>
+              <w:rPr>
+                <w:sz w:val="20"/>
+              </w:rPr>
+              <w:t>0,844</w:t>
+            </w:r>
+          </w:p>
+        </w:tc>
+        <w:tc>
+          <w:tcPr>
+            <w:tcW w:type="dxa" w:w="1247"/>
+            <w:shd w:val="clear" w:color="auto" w:fill="F0F5FC"/>
+          </w:tcPr>
+          <w:p>
+            <w:pPr>
+              <w:spacing w:after="20" w:line="264" w:lineRule="auto"/>
+              <w:jc w:val="center"/>
+            </w:pPr>
+            <w:r/>
+            <w:r>
+              <w:rPr>
+                <w:sz w:val="20"/>
+              </w:rPr>
+              <w:t>0,893</w:t>
+            </w:r>
+          </w:p>
+        </w:tc>
+        <w:tc>
+          <w:tcPr>
+            <w:tcW w:type="dxa" w:w="2778"/>
+            <w:shd w:val="clear" w:color="auto" w:fill="F0F5FC"/>
+          </w:tcPr>
+          <w:p>
+            <w:pPr>
+              <w:spacing w:after="20" w:line="264" w:lineRule="auto"/>
+              <w:jc w:val="center"/>
+            </w:pPr>
+            <w:r/>
+            <w:r>
+              <w:rPr>
+                <w:sz w:val="20"/>
+              </w:rPr>
+              <w:t>−0,049 [−0,145; +0,056]</w:t>
+            </w:r>
+          </w:p>
+        </w:tc>
+      </w:tr>
+      <w:tr>
+        <w:trPr>
+          <w:cantSplit w:val="true"/>
+        </w:trPr>
+        <w:tc>
+          <w:tcPr>
+            <w:tcW w:type="dxa" w:w="1814"/>
+          </w:tcPr>
+          <w:p>
+            <w:pPr>
+              <w:spacing w:after="20" w:line="264" w:lineRule="auto"/>
+              <w:jc w:val="left"/>
+            </w:pPr>
+            <w:r>
+              <w:rPr>
+                <w:b/>
+              </w:rPr>
+            </w:r>
+            <w:r>
+              <w:rPr>
+                <w:b/>
+                <w:sz w:val="20"/>
+              </w:rPr>
+              <w:t>Hallucination rate</w:t>
+            </w:r>
+          </w:p>
+        </w:tc>
+        <w:tc>
+          <w:tcPr>
+            <w:tcW w:type="dxa" w:w="1304"/>
+          </w:tcPr>
+          <w:p>
+            <w:pPr>
+              <w:spacing w:after="20" w:line="264" w:lineRule="auto"/>
+              <w:jc w:val="left"/>
+            </w:pPr>
+            <w:r/>
+            <w:r>
+              <w:rPr>
+                <w:sz w:val="20"/>
+              </w:rPr>
+              <w:t>Human judge</w:t>
+            </w:r>
+          </w:p>
+        </w:tc>
+        <w:tc>
+          <w:tcPr>
+            <w:tcW w:type="dxa" w:w="680"/>
+          </w:tcPr>
+          <w:p>
+            <w:pPr>
+              <w:spacing w:after="20" w:line="264" w:lineRule="auto"/>
+              <w:jc w:val="center"/>
+            </w:pPr>
+            <w:r/>
+            <w:r>
+              <w:rPr>
+                <w:sz w:val="20"/>
+              </w:rPr>
+              <w:t>18</w:t>
+            </w:r>
+          </w:p>
+        </w:tc>
+        <w:tc>
+          <w:tcPr>
+            <w:tcW w:type="dxa" w:w="1247"/>
+          </w:tcPr>
+          <w:p>
+            <w:pPr>
+              <w:spacing w:after="20" w:line="264" w:lineRule="auto"/>
+              <w:jc w:val="center"/>
+            </w:pPr>
+            <w:r/>
+            <w:r>
+              <w:rPr>
+                <w:sz w:val="20"/>
+              </w:rPr>
+              <w:t>0,056</w:t>
+            </w:r>
+          </w:p>
+        </w:tc>
+        <w:tc>
+          <w:tcPr>
+            <w:tcW w:type="dxa" w:w="1247"/>
+          </w:tcPr>
+          <w:p>
+            <w:pPr>
+              <w:spacing w:after="20" w:line="264" w:lineRule="auto"/>
+              <w:jc w:val="center"/>
+            </w:pPr>
+            <w:r/>
+            <w:r>
+              <w:rPr>
+                <w:sz w:val="20"/>
+              </w:rPr>
+              <w:t>0,222</w:t>
+            </w:r>
+          </w:p>
+        </w:tc>
+        <w:tc>
+          <w:tcPr>
+            <w:tcW w:type="dxa" w:w="2778"/>
+          </w:tcPr>
+          <w:p>
+            <w:pPr>
+              <w:spacing w:after="20" w:line="264" w:lineRule="auto"/>
+              <w:jc w:val="center"/>
+            </w:pPr>
+            <w:r/>
+            <w:r>
+              <w:rPr>
+                <w:sz w:val="20"/>
+              </w:rPr>
+              <w:t>−0,167 [−0,333; +0,000]</w:t>
+            </w:r>
+          </w:p>
+        </w:tc>
+      </w:tr>
+      <w:tr>
+        <w:trPr>
+          <w:cantSplit w:val="true"/>
+        </w:trPr>
+        <w:tc>
+          <w:tcPr>
+            <w:tcW w:type="dxa" w:w="1814"/>
+            <w:shd w:val="clear" w:color="auto" w:fill="F0F5FC"/>
+          </w:tcPr>
+          <w:p>
+            <w:pPr>
+              <w:spacing w:after="20" w:line="264" w:lineRule="auto"/>
+              <w:jc w:val="left"/>
+            </w:pPr>
+            <w:r>
+              <w:rPr>
+                <w:b/>
+              </w:rPr>
+            </w:r>
+          </w:p>
+        </w:tc>
+        <w:tc>
+          <w:tcPr>
+            <w:tcW w:type="dxa" w:w="1304"/>
+            <w:shd w:val="clear" w:color="auto" w:fill="F0F5FC"/>
+          </w:tcPr>
+          <w:p>
+            <w:pPr>
+              <w:spacing w:after="20" w:line="264" w:lineRule="auto"/>
+              <w:jc w:val="left"/>
+            </w:pPr>
+            <w:r/>
+            <w:r>
+              <w:rPr>
+                <w:sz w:val="20"/>
+              </w:rPr>
+              <w:t>Judge</w:t>
+            </w:r>
+          </w:p>
+        </w:tc>
+        <w:tc>
+          <w:tcPr>
+            <w:tcW w:type="dxa" w:w="680"/>
+            <w:shd w:val="clear" w:color="auto" w:fill="F0F5FC"/>
+          </w:tcPr>
+          <w:p>
+            <w:pPr>
+              <w:spacing w:after="20" w:line="264" w:lineRule="auto"/>
+              <w:jc w:val="center"/>
+            </w:pPr>
+            <w:r/>
+            <w:r>
+              <w:rPr>
+                <w:sz w:val="20"/>
+              </w:rPr>
+              <w:t>18</w:t>
+            </w:r>
+          </w:p>
+        </w:tc>
+        <w:tc>
+          <w:tcPr>
+            <w:tcW w:type="dxa" w:w="1247"/>
+            <w:shd w:val="clear" w:color="auto" w:fill="F0F5FC"/>
+          </w:tcPr>
+          <w:p>
+            <w:pPr>
+              <w:spacing w:after="20" w:line="264" w:lineRule="auto"/>
+              <w:jc w:val="center"/>
+            </w:pPr>
+            <w:r/>
+            <w:r>
+              <w:rPr>
+                <w:sz w:val="20"/>
+              </w:rPr>
+              <w:t>0,556</w:t>
+            </w:r>
+          </w:p>
+        </w:tc>
+        <w:tc>
+          <w:tcPr>
+            <w:tcW w:type="dxa" w:w="1247"/>
+            <w:shd w:val="clear" w:color="auto" w:fill="F0F5FC"/>
+          </w:tcPr>
+          <w:p>
+            <w:pPr>
+              <w:spacing w:after="20" w:line="264" w:lineRule="auto"/>
+              <w:jc w:val="center"/>
+            </w:pPr>
+            <w:r/>
+            <w:r>
+              <w:rPr>
+                <w:sz w:val="20"/>
+              </w:rPr>
+              <w:t>0,389</w:t>
+            </w:r>
+          </w:p>
+        </w:tc>
+        <w:tc>
+          <w:tcPr>
+            <w:tcW w:type="dxa" w:w="2778"/>
+            <w:shd w:val="clear" w:color="auto" w:fill="F0F5FC"/>
+          </w:tcPr>
+          <w:p>
+            <w:pPr>
+              <w:spacing w:after="20" w:line="264" w:lineRule="auto"/>
+              <w:jc w:val="center"/>
+            </w:pPr>
+            <w:r/>
+            <w:r>
+              <w:rPr>
+                <w:sz w:val="20"/>
+              </w:rPr>
+              <w:t>+0,167 [−0,111; +0,444]</w:t>
+            </w:r>
+          </w:p>
+        </w:tc>
+      </w:tr>
+      <w:tr>
+        <w:trPr>
+          <w:cantSplit w:val="true"/>
+        </w:trPr>
+        <w:tc>
+          <w:tcPr>
+            <w:tcW w:type="dxa" w:w="1814"/>
+          </w:tcPr>
+          <w:p>
+            <w:pPr>
+              <w:spacing w:after="20" w:line="264" w:lineRule="auto"/>
+              <w:jc w:val="left"/>
+            </w:pPr>
+            <w:r>
+              <w:rPr>
+                <w:b/>
+              </w:rPr>
+            </w:r>
+            <w:r>
+              <w:rPr>
+                <w:b/>
+                <w:sz w:val="20"/>
+              </w:rPr>
+              <w:t>Answer correctness</w:t>
+            </w:r>
+          </w:p>
+        </w:tc>
+        <w:tc>
+          <w:tcPr>
+            <w:tcW w:type="dxa" w:w="1304"/>
+          </w:tcPr>
+          <w:p>
+            <w:pPr>
+              <w:spacing w:after="20" w:line="264" w:lineRule="auto"/>
+              <w:jc w:val="left"/>
+            </w:pPr>
+            <w:r/>
+            <w:r>
+              <w:rPr>
+                <w:sz w:val="20"/>
+              </w:rPr>
+              <w:t>Human judge</w:t>
+            </w:r>
+          </w:p>
+        </w:tc>
+        <w:tc>
+          <w:tcPr>
+            <w:tcW w:type="dxa" w:w="680"/>
+          </w:tcPr>
+          <w:p>
+            <w:pPr>
+              <w:spacing w:after="20" w:line="264" w:lineRule="auto"/>
+              <w:jc w:val="center"/>
+            </w:pPr>
+            <w:r/>
+            <w:r>
+              <w:rPr>
+                <w:sz w:val="20"/>
+              </w:rPr>
+              <w:t>18</w:t>
+            </w:r>
+          </w:p>
+        </w:tc>
+        <w:tc>
+          <w:tcPr>
+            <w:tcW w:type="dxa" w:w="1247"/>
+          </w:tcPr>
+          <w:p>
+            <w:pPr>
+              <w:spacing w:after="20" w:line="264" w:lineRule="auto"/>
+              <w:jc w:val="center"/>
+            </w:pPr>
+            <w:r/>
+            <w:r>
+              <w:rPr>
+                <w:sz w:val="20"/>
+              </w:rPr>
+              <w:t>0,333</w:t>
+            </w:r>
+          </w:p>
+        </w:tc>
+        <w:tc>
+          <w:tcPr>
+            <w:tcW w:type="dxa" w:w="1247"/>
+          </w:tcPr>
+          <w:p>
+            <w:pPr>
+              <w:spacing w:after="20" w:line="264" w:lineRule="auto"/>
+              <w:jc w:val="center"/>
+            </w:pPr>
+            <w:r/>
+            <w:r>
+              <w:rPr>
+                <w:sz w:val="20"/>
+              </w:rPr>
+              <w:t>0,500</w:t>
+            </w:r>
+          </w:p>
+        </w:tc>
+        <w:tc>
+          <w:tcPr>
+            <w:tcW w:type="dxa" w:w="2778"/>
+          </w:tcPr>
+          <w:p>
+            <w:pPr>
+              <w:spacing w:after="20" w:line="264" w:lineRule="auto"/>
+              <w:jc w:val="center"/>
+            </w:pPr>
+            <w:r/>
+            <w:r>
+              <w:rPr>
+                <w:sz w:val="20"/>
+              </w:rPr>
+              <w:t>−0,167 [−0,389; +0,056]</w:t>
+            </w:r>
+          </w:p>
+        </w:tc>
+      </w:tr>
+      <w:tr>
+        <w:trPr>
+          <w:cantSplit w:val="true"/>
+        </w:trPr>
+        <w:tc>
+          <w:tcPr>
+            <w:tcW w:type="dxa" w:w="1814"/>
+            <w:shd w:val="clear" w:color="auto" w:fill="F0F5FC"/>
+          </w:tcPr>
+          <w:p>
+            <w:pPr>
+              <w:spacing w:after="20" w:line="264" w:lineRule="auto"/>
+              <w:jc w:val="left"/>
+            </w:pPr>
+            <w:r>
+              <w:rPr>
+                <w:b/>
+              </w:rPr>
+            </w:r>
+          </w:p>
+        </w:tc>
+        <w:tc>
+          <w:tcPr>
+            <w:tcW w:type="dxa" w:w="1304"/>
+            <w:shd w:val="clear" w:color="auto" w:fill="F0F5FC"/>
+          </w:tcPr>
+          <w:p>
+            <w:pPr>
+              <w:spacing w:after="20" w:line="264" w:lineRule="auto"/>
+              <w:jc w:val="left"/>
+            </w:pPr>
+            <w:r/>
+            <w:r>
+              <w:rPr>
+                <w:sz w:val="20"/>
+              </w:rPr>
+              <w:t>Judge</w:t>
+            </w:r>
+          </w:p>
+        </w:tc>
+        <w:tc>
+          <w:tcPr>
+            <w:tcW w:type="dxa" w:w="680"/>
+            <w:shd w:val="clear" w:color="auto" w:fill="F0F5FC"/>
+          </w:tcPr>
+          <w:p>
+            <w:pPr>
+              <w:spacing w:after="20" w:line="264" w:lineRule="auto"/>
+              <w:jc w:val="center"/>
+            </w:pPr>
+            <w:r/>
+            <w:r>
+              <w:rPr>
+                <w:sz w:val="20"/>
+              </w:rPr>
+              <w:t>18</w:t>
+            </w:r>
+          </w:p>
+        </w:tc>
+        <w:tc>
+          <w:tcPr>
+            <w:tcW w:type="dxa" w:w="1247"/>
+            <w:shd w:val="clear" w:color="auto" w:fill="F0F5FC"/>
+          </w:tcPr>
+          <w:p>
+            <w:pPr>
+              <w:spacing w:after="20" w:line="264" w:lineRule="auto"/>
+              <w:jc w:val="center"/>
+            </w:pPr>
+            <w:r/>
+            <w:r>
+              <w:rPr>
+                <w:sz w:val="20"/>
+              </w:rPr>
+              <w:t>0,833</w:t>
+            </w:r>
+          </w:p>
+        </w:tc>
+        <w:tc>
+          <w:tcPr>
+            <w:tcW w:type="dxa" w:w="1247"/>
+            <w:shd w:val="clear" w:color="auto" w:fill="F0F5FC"/>
+          </w:tcPr>
+          <w:p>
+            <w:pPr>
+              <w:spacing w:after="20" w:line="264" w:lineRule="auto"/>
+              <w:jc w:val="center"/>
+            </w:pPr>
+            <w:r/>
+            <w:r>
+              <w:rPr>
+                <w:sz w:val="20"/>
+              </w:rPr>
+              <w:t>0,833</w:t>
+            </w:r>
+          </w:p>
+        </w:tc>
+        <w:tc>
+          <w:tcPr>
+            <w:tcW w:type="dxa" w:w="2778"/>
+            <w:shd w:val="clear" w:color="auto" w:fill="F0F5FC"/>
+          </w:tcPr>
+          <w:p>
+            <w:pPr>
+              <w:spacing w:after="20" w:line="264" w:lineRule="auto"/>
+              <w:jc w:val="center"/>
+            </w:pPr>
+            <w:r/>
+            <w:r>
+              <w:rPr>
+                <w:sz w:val="20"/>
+              </w:rPr>
+              <w:t>+0,000 [−0,222; +0,222]</w:t>
+            </w:r>
+          </w:p>
+        </w:tc>
+      </w:tr>
+    </w:tbl>
+    <w:p>
+      <w:pPr>
+        <w:spacing w:after="40"/>
+      </w:pPr>
+    </w:p>
+    <w:p>
+      <w:pPr>
+        <w:ind w:firstLine="567"/>
+      </w:pPr>
+      <w:r>
+        <w:t>Trên mẫu này, nhãn human judge cho cùng hướng với kết luận chính về retrieval precision (GraphRAG thấp hơn: −0,097 [−0,208; +0,014], n = 18 cặp, chưa có statistical significance do mẫu nhỏ), còn ở answer correctness và hallucination rate vẫn không đủ bằng chứng để phân biệt hai hệ. Khác biệt duy nhất có statistical significance theo nhãn human judge là faithfulness: GraphRAG cao hơn (+0,062 [+0,010; +0,138], n = 15 cặp), trong khi judge không phát hiện khác biệt này; vì mẫu nhỏ và đây là một trong nhiều so sánh, kết quả này chỉ mang tính gợi ý.</w:t>
+      </w:r>
+    </w:p>
+    <w:p>
+      <w:pPr>
         <w:pStyle w:val="Heading1"/>
       </w:pPr>
       <w:r>
@@ -6140,7 +7890,7 @@
         <w:t xml:space="preserve">Judge: </w:t>
       </w:r>
       <w:r>
-        <w:t>llama3.1:8b có nhiễu khi chấm và có judge failure (mục 8.4); chưa có đánh giá của con người để đối chứng. Kết luận chỉ dựa trên các chênh lệch có statistical significance.</w:t>
+        <w:t>llama3.1:8b có nhiễu khi chấm, có judge failure (mục 8.4) và agreement với human judge thấp (mục 8.5). Kết luận chỉ dựa trên các chênh lệch có statistical significance.</w:t>
       </w:r>
     </w:p>
     <w:p>

</xml_diff>

<commit_message>
Nội dung 2: giải thích nguồn chênh lệch giữa human judge và judge (báo cáo mục 8.5, Bảng 11)
- human_judge.py: thêm phân tích chiều lệch, tỉ lệ "có" theo loại câu, hệ thống, vị trí passage
- Bao_cao_Y2: Bảng 11 và ba nguyên nhân chênh lệch (answer correctness, passage hữu ích, verify claim)
</commit_message>
<xml_diff>
--- a/report/Bao_cao_Y2.docx
+++ b/report/Bao_cao_Y2.docx
@@ -6667,7 +6667,7 @@
         <w:ind w:firstLine="567"/>
       </w:pPr>
       <w:r>
-        <w:t>Agreement giữa human judge và judge thấp: κ từ 0,14 đến 0,28, tức mức rất thấp đến thấp theo Landis &amp; Koch. Sai lệch có hướng rõ và ngược chiều nhau giữa các prompt: ở bước chấm passage và answer correctness, judge dễ dãi hơn (tính 51% passage là hữu ích so với 20% của human judge; 83% câu trả lời là đúng so với 42%), còn ở bước verify claim judge khắt khe hơn (53% câu trả lời có claim không được hỗ trợ so với 16%; faithfulness trung bình 0,869 so với 0,962, tương quan Pearson 0,43, n = 32). Như vậy mức tuyệt đối của các metric do judge chấm (Bảng 7) không nên đọc như độ chính xác thực của hệ thống; theo nhãn human judge, answer correctness trên mẫu này thấp hơn khoảng một nửa.</w:t>
+        <w:t>Agreement giữa human judge và judge thấp: κ từ 0,14 đến 0,28, tức mức rất thấp đến thấp theo Landis &amp; Koch. Sai lệch có hướng rõ và ngược chiều nhau giữa các prompt: ở bước chấm passage và answer correctness, judge dễ dãi hơn (tính 51% passage là hữu ích so với 20% của human judge; 83% câu trả lời là đúng so với 42%), còn ở bước verify claim judge khắt khe hơn (53% câu trả lời có claim không được hỗ trợ so với 16%; faithfulness trung bình 0,869 so với 0,962, tương quan Pearson 0,43, n = 32).</w:t>
       </w:r>
     </w:p>
     <w:p>
@@ -6677,7 +6677,825 @@
         <w:jc w:val="center"/>
       </w:pPr>
       <w:r>
-        <w:t>Bảng 11. GraphRAG − Vector RAG trên cùng mẫu, tính bằng nhãn human judge và nhãn judge (in đậm: có statistical significance)</w:t>
+        <w:t>Bảng 11. Nguồn chênh lệch giữa human judge và judge: tỉ lệ "có" (faithfulness: trung bình) theo loại câu, hệ thống và vị trí passage</w:t>
+      </w:r>
+    </w:p>
+    <w:tbl>
+      <w:tblPr>
+        <w:tblStyle w:val="TableGrid"/>
+        <w:tblW w:type="auto" w:w="0"/>
+        <w:jc w:val="center"/>
+        <w:tblLayout w:type="fixed"/>
+        <w:tblLook w:firstColumn="1" w:firstRow="1" w:lastColumn="0" w:lastRow="0" w:noHBand="0" w:noVBand="1" w:val="04A0"/>
+      </w:tblPr>
+      <w:tblGrid>
+        <w:gridCol w:w="2268"/>
+        <w:gridCol w:w="2268"/>
+        <w:gridCol w:w="2268"/>
+        <w:gridCol w:w="2268"/>
+      </w:tblGrid>
+      <w:tr>
+        <w:trPr>
+          <w:tblHeader w:val="true"/>
+          <w:cantSplit w:val="true"/>
+        </w:trPr>
+        <w:tc>
+          <w:tcPr>
+            <w:tcW w:type="dxa" w:w="2381"/>
+            <w:shd w:val="clear" w:color="auto" w:fill="1C5CAB"/>
+          </w:tcPr>
+          <w:p>
+            <w:pPr>
+              <w:spacing w:after="20" w:line="264" w:lineRule="auto"/>
+              <w:jc w:val="center"/>
+            </w:pPr>
+            <w:r/>
+            <w:r>
+              <w:rPr>
+                <w:b/>
+                <w:color w:val="FFFFFF"/>
+                <w:sz w:val="21"/>
+              </w:rPr>
+              <w:t>Nhãn</w:t>
+            </w:r>
+          </w:p>
+        </w:tc>
+        <w:tc>
+          <w:tcPr>
+            <w:tcW w:type="dxa" w:w="2608"/>
+            <w:shd w:val="clear" w:color="auto" w:fill="1C5CAB"/>
+          </w:tcPr>
+          <w:p>
+            <w:pPr>
+              <w:spacing w:after="20" w:line="264" w:lineRule="auto"/>
+              <w:jc w:val="center"/>
+            </w:pPr>
+            <w:r/>
+            <w:r>
+              <w:rPr>
+                <w:b/>
+                <w:color w:val="FFFFFF"/>
+                <w:sz w:val="21"/>
+              </w:rPr>
+              <w:t>Nhóm</w:t>
+            </w:r>
+          </w:p>
+        </w:tc>
+        <w:tc>
+          <w:tcPr>
+            <w:tcW w:type="dxa" w:w="1701"/>
+            <w:shd w:val="clear" w:color="auto" w:fill="1C5CAB"/>
+          </w:tcPr>
+          <w:p>
+            <w:pPr>
+              <w:spacing w:after="20" w:line="264" w:lineRule="auto"/>
+              <w:jc w:val="center"/>
+            </w:pPr>
+            <w:r/>
+            <w:r>
+              <w:rPr>
+                <w:b/>
+                <w:color w:val="FFFFFF"/>
+                <w:sz w:val="21"/>
+              </w:rPr>
+              <w:t>Human judge</w:t>
+            </w:r>
+          </w:p>
+        </w:tc>
+        <w:tc>
+          <w:tcPr>
+            <w:tcW w:type="dxa" w:w="1701"/>
+            <w:shd w:val="clear" w:color="auto" w:fill="1C5CAB"/>
+          </w:tcPr>
+          <w:p>
+            <w:pPr>
+              <w:spacing w:after="20" w:line="264" w:lineRule="auto"/>
+              <w:jc w:val="center"/>
+            </w:pPr>
+            <w:r/>
+            <w:r>
+              <w:rPr>
+                <w:b/>
+                <w:color w:val="FFFFFF"/>
+                <w:sz w:val="21"/>
+              </w:rPr>
+              <w:t>Judge</w:t>
+            </w:r>
+          </w:p>
+        </w:tc>
+      </w:tr>
+      <w:tr>
+        <w:trPr>
+          <w:cantSplit w:val="true"/>
+        </w:trPr>
+        <w:tc>
+          <w:tcPr>
+            <w:tcW w:type="dxa" w:w="2381"/>
+          </w:tcPr>
+          <w:p>
+            <w:pPr>
+              <w:spacing w:after="20" w:line="264" w:lineRule="auto"/>
+              <w:jc w:val="left"/>
+            </w:pPr>
+            <w:r>
+              <w:rPr>
+                <w:b/>
+              </w:rPr>
+            </w:r>
+            <w:r>
+              <w:rPr>
+                <w:b/>
+                <w:sz w:val="21"/>
+              </w:rPr>
+              <w:t>Answer correctness</w:t>
+            </w:r>
+          </w:p>
+        </w:tc>
+        <w:tc>
+          <w:tcPr>
+            <w:tcW w:type="dxa" w:w="2608"/>
+          </w:tcPr>
+          <w:p>
+            <w:pPr>
+              <w:spacing w:after="20" w:line="264" w:lineRule="auto"/>
+              <w:jc w:val="left"/>
+            </w:pPr>
+            <w:r/>
+            <w:r>
+              <w:rPr>
+                <w:sz w:val="21"/>
+              </w:rPr>
+              <w:t>Single-hop</w:t>
+            </w:r>
+          </w:p>
+        </w:tc>
+        <w:tc>
+          <w:tcPr>
+            <w:tcW w:type="dxa" w:w="1701"/>
+          </w:tcPr>
+          <w:p>
+            <w:pPr>
+              <w:spacing w:after="20" w:line="264" w:lineRule="auto"/>
+              <w:jc w:val="center"/>
+            </w:pPr>
+            <w:r/>
+            <w:r>
+              <w:rPr>
+                <w:sz w:val="21"/>
+              </w:rPr>
+              <w:t>61%</w:t>
+            </w:r>
+          </w:p>
+        </w:tc>
+        <w:tc>
+          <w:tcPr>
+            <w:tcW w:type="dxa" w:w="1701"/>
+          </w:tcPr>
+          <w:p>
+            <w:pPr>
+              <w:spacing w:after="20" w:line="264" w:lineRule="auto"/>
+              <w:jc w:val="center"/>
+            </w:pPr>
+            <w:r/>
+            <w:r>
+              <w:rPr>
+                <w:sz w:val="21"/>
+              </w:rPr>
+              <w:t>72%</w:t>
+            </w:r>
+          </w:p>
+        </w:tc>
+      </w:tr>
+      <w:tr>
+        <w:trPr>
+          <w:cantSplit w:val="true"/>
+        </w:trPr>
+        <w:tc>
+          <w:tcPr>
+            <w:tcW w:type="dxa" w:w="2381"/>
+            <w:shd w:val="clear" w:color="auto" w:fill="F0F5FC"/>
+          </w:tcPr>
+          <w:p>
+            <w:pPr>
+              <w:spacing w:after="20" w:line="264" w:lineRule="auto"/>
+              <w:jc w:val="left"/>
+            </w:pPr>
+            <w:r>
+              <w:rPr>
+                <w:b/>
+              </w:rPr>
+            </w:r>
+          </w:p>
+        </w:tc>
+        <w:tc>
+          <w:tcPr>
+            <w:tcW w:type="dxa" w:w="2608"/>
+            <w:shd w:val="clear" w:color="auto" w:fill="F0F5FC"/>
+          </w:tcPr>
+          <w:p>
+            <w:pPr>
+              <w:spacing w:after="20" w:line="264" w:lineRule="auto"/>
+              <w:jc w:val="left"/>
+            </w:pPr>
+            <w:r/>
+            <w:r>
+              <w:rPr>
+                <w:sz w:val="21"/>
+              </w:rPr>
+              <w:t>Multi-hop</w:t>
+            </w:r>
+          </w:p>
+        </w:tc>
+        <w:tc>
+          <w:tcPr>
+            <w:tcW w:type="dxa" w:w="1701"/>
+            <w:shd w:val="clear" w:color="auto" w:fill="F0F5FC"/>
+          </w:tcPr>
+          <w:p>
+            <w:pPr>
+              <w:spacing w:after="20" w:line="264" w:lineRule="auto"/>
+              <w:jc w:val="center"/>
+            </w:pPr>
+            <w:r/>
+            <w:r>
+              <w:rPr>
+                <w:sz w:val="21"/>
+              </w:rPr>
+              <w:t>22%</w:t>
+            </w:r>
+          </w:p>
+        </w:tc>
+        <w:tc>
+          <w:tcPr>
+            <w:tcW w:type="dxa" w:w="1701"/>
+            <w:shd w:val="clear" w:color="auto" w:fill="F0F5FC"/>
+          </w:tcPr>
+          <w:p>
+            <w:pPr>
+              <w:spacing w:after="20" w:line="264" w:lineRule="auto"/>
+              <w:jc w:val="center"/>
+            </w:pPr>
+            <w:r/>
+            <w:r>
+              <w:rPr>
+                <w:sz w:val="21"/>
+              </w:rPr>
+              <w:t>94%</w:t>
+            </w:r>
+          </w:p>
+        </w:tc>
+      </w:tr>
+      <w:tr>
+        <w:trPr>
+          <w:cantSplit w:val="true"/>
+        </w:trPr>
+        <w:tc>
+          <w:tcPr>
+            <w:tcW w:type="dxa" w:w="2381"/>
+          </w:tcPr>
+          <w:p>
+            <w:pPr>
+              <w:spacing w:after="20" w:line="264" w:lineRule="auto"/>
+              <w:jc w:val="left"/>
+            </w:pPr>
+            <w:r>
+              <w:rPr>
+                <w:b/>
+              </w:rPr>
+            </w:r>
+            <w:r>
+              <w:rPr>
+                <w:b/>
+                <w:sz w:val="21"/>
+              </w:rPr>
+              <w:t>Passage hữu ích</w:t>
+            </w:r>
+          </w:p>
+        </w:tc>
+        <w:tc>
+          <w:tcPr>
+            <w:tcW w:type="dxa" w:w="2608"/>
+          </w:tcPr>
+          <w:p>
+            <w:pPr>
+              <w:spacing w:after="20" w:line="264" w:lineRule="auto"/>
+              <w:jc w:val="left"/>
+            </w:pPr>
+            <w:r/>
+            <w:r>
+              <w:rPr>
+                <w:sz w:val="21"/>
+              </w:rPr>
+              <w:t>GraphRAG</w:t>
+            </w:r>
+          </w:p>
+        </w:tc>
+        <w:tc>
+          <w:tcPr>
+            <w:tcW w:type="dxa" w:w="1701"/>
+          </w:tcPr>
+          <w:p>
+            <w:pPr>
+              <w:spacing w:after="20" w:line="264" w:lineRule="auto"/>
+              <w:jc w:val="center"/>
+            </w:pPr>
+            <w:r/>
+            <w:r>
+              <w:rPr>
+                <w:sz w:val="21"/>
+              </w:rPr>
+              <w:t>15%</w:t>
+            </w:r>
+          </w:p>
+        </w:tc>
+        <w:tc>
+          <w:tcPr>
+            <w:tcW w:type="dxa" w:w="1701"/>
+          </w:tcPr>
+          <w:p>
+            <w:pPr>
+              <w:spacing w:after="20" w:line="264" w:lineRule="auto"/>
+              <w:jc w:val="center"/>
+            </w:pPr>
+            <w:r/>
+            <w:r>
+              <w:rPr>
+                <w:sz w:val="21"/>
+              </w:rPr>
+              <w:t>51%</w:t>
+            </w:r>
+          </w:p>
+        </w:tc>
+      </w:tr>
+      <w:tr>
+        <w:trPr>
+          <w:cantSplit w:val="true"/>
+        </w:trPr>
+        <w:tc>
+          <w:tcPr>
+            <w:tcW w:type="dxa" w:w="2381"/>
+            <w:shd w:val="clear" w:color="auto" w:fill="F0F5FC"/>
+          </w:tcPr>
+          <w:p>
+            <w:pPr>
+              <w:spacing w:after="20" w:line="264" w:lineRule="auto"/>
+              <w:jc w:val="left"/>
+            </w:pPr>
+            <w:r>
+              <w:rPr>
+                <w:b/>
+              </w:rPr>
+            </w:r>
+          </w:p>
+        </w:tc>
+        <w:tc>
+          <w:tcPr>
+            <w:tcW w:type="dxa" w:w="2608"/>
+            <w:shd w:val="clear" w:color="auto" w:fill="F0F5FC"/>
+          </w:tcPr>
+          <w:p>
+            <w:pPr>
+              <w:spacing w:after="20" w:line="264" w:lineRule="auto"/>
+              <w:jc w:val="left"/>
+            </w:pPr>
+            <w:r/>
+            <w:r>
+              <w:rPr>
+                <w:sz w:val="21"/>
+              </w:rPr>
+              <w:t>Vector RAG</w:t>
+            </w:r>
+          </w:p>
+        </w:tc>
+        <w:tc>
+          <w:tcPr>
+            <w:tcW w:type="dxa" w:w="1701"/>
+            <w:shd w:val="clear" w:color="auto" w:fill="F0F5FC"/>
+          </w:tcPr>
+          <w:p>
+            <w:pPr>
+              <w:spacing w:after="20" w:line="264" w:lineRule="auto"/>
+              <w:jc w:val="center"/>
+            </w:pPr>
+            <w:r/>
+            <w:r>
+              <w:rPr>
+                <w:sz w:val="21"/>
+              </w:rPr>
+              <w:t>25%</w:t>
+            </w:r>
+          </w:p>
+        </w:tc>
+        <w:tc>
+          <w:tcPr>
+            <w:tcW w:type="dxa" w:w="1701"/>
+            <w:shd w:val="clear" w:color="auto" w:fill="F0F5FC"/>
+          </w:tcPr>
+          <w:p>
+            <w:pPr>
+              <w:spacing w:after="20" w:line="264" w:lineRule="auto"/>
+              <w:jc w:val="center"/>
+            </w:pPr>
+            <w:r/>
+            <w:r>
+              <w:rPr>
+                <w:sz w:val="21"/>
+              </w:rPr>
+              <w:t>51%</w:t>
+            </w:r>
+          </w:p>
+        </w:tc>
+      </w:tr>
+      <w:tr>
+        <w:trPr>
+          <w:cantSplit w:val="true"/>
+        </w:trPr>
+        <w:tc>
+          <w:tcPr>
+            <w:tcW w:type="dxa" w:w="2381"/>
+          </w:tcPr>
+          <w:p>
+            <w:pPr>
+              <w:spacing w:after="20" w:line="264" w:lineRule="auto"/>
+              <w:jc w:val="left"/>
+            </w:pPr>
+            <w:r>
+              <w:rPr>
+                <w:b/>
+              </w:rPr>
+            </w:r>
+          </w:p>
+        </w:tc>
+        <w:tc>
+          <w:tcPr>
+            <w:tcW w:type="dxa" w:w="2608"/>
+          </w:tcPr>
+          <w:p>
+            <w:pPr>
+              <w:spacing w:after="20" w:line="264" w:lineRule="auto"/>
+              <w:jc w:val="left"/>
+            </w:pPr>
+            <w:r/>
+            <w:r>
+              <w:rPr>
+                <w:sz w:val="21"/>
+              </w:rPr>
+              <w:t>Passage xếp hạng 1</w:t>
+            </w:r>
+          </w:p>
+        </w:tc>
+        <w:tc>
+          <w:tcPr>
+            <w:tcW w:type="dxa" w:w="1701"/>
+          </w:tcPr>
+          <w:p>
+            <w:pPr>
+              <w:spacing w:after="20" w:line="264" w:lineRule="auto"/>
+              <w:jc w:val="center"/>
+            </w:pPr>
+            <w:r/>
+            <w:r>
+              <w:rPr>
+                <w:sz w:val="21"/>
+              </w:rPr>
+              <w:t>39%</w:t>
+            </w:r>
+          </w:p>
+        </w:tc>
+        <w:tc>
+          <w:tcPr>
+            <w:tcW w:type="dxa" w:w="1701"/>
+          </w:tcPr>
+          <w:p>
+            <w:pPr>
+              <w:spacing w:after="20" w:line="264" w:lineRule="auto"/>
+              <w:jc w:val="center"/>
+            </w:pPr>
+            <w:r/>
+            <w:r>
+              <w:rPr>
+                <w:sz w:val="21"/>
+              </w:rPr>
+              <w:t>61%</w:t>
+            </w:r>
+          </w:p>
+        </w:tc>
+      </w:tr>
+      <w:tr>
+        <w:trPr>
+          <w:cantSplit w:val="true"/>
+        </w:trPr>
+        <w:tc>
+          <w:tcPr>
+            <w:tcW w:type="dxa" w:w="2381"/>
+            <w:shd w:val="clear" w:color="auto" w:fill="F0F5FC"/>
+          </w:tcPr>
+          <w:p>
+            <w:pPr>
+              <w:spacing w:after="20" w:line="264" w:lineRule="auto"/>
+              <w:jc w:val="left"/>
+            </w:pPr>
+            <w:r>
+              <w:rPr>
+                <w:b/>
+              </w:rPr>
+            </w:r>
+          </w:p>
+        </w:tc>
+        <w:tc>
+          <w:tcPr>
+            <w:tcW w:type="dxa" w:w="2608"/>
+            <w:shd w:val="clear" w:color="auto" w:fill="F0F5FC"/>
+          </w:tcPr>
+          <w:p>
+            <w:pPr>
+              <w:spacing w:after="20" w:line="264" w:lineRule="auto"/>
+              <w:jc w:val="left"/>
+            </w:pPr>
+            <w:r/>
+            <w:r>
+              <w:rPr>
+                <w:sz w:val="21"/>
+              </w:rPr>
+              <w:t>Passage xếp hạng 2–4</w:t>
+            </w:r>
+          </w:p>
+        </w:tc>
+        <w:tc>
+          <w:tcPr>
+            <w:tcW w:type="dxa" w:w="1701"/>
+            <w:shd w:val="clear" w:color="auto" w:fill="F0F5FC"/>
+          </w:tcPr>
+          <w:p>
+            <w:pPr>
+              <w:spacing w:after="20" w:line="264" w:lineRule="auto"/>
+              <w:jc w:val="center"/>
+            </w:pPr>
+            <w:r/>
+            <w:r>
+              <w:rPr>
+                <w:sz w:val="21"/>
+              </w:rPr>
+              <w:t>14%</w:t>
+            </w:r>
+          </w:p>
+        </w:tc>
+        <w:tc>
+          <w:tcPr>
+            <w:tcW w:type="dxa" w:w="1701"/>
+            <w:shd w:val="clear" w:color="auto" w:fill="F0F5FC"/>
+          </w:tcPr>
+          <w:p>
+            <w:pPr>
+              <w:spacing w:after="20" w:line="264" w:lineRule="auto"/>
+              <w:jc w:val="center"/>
+            </w:pPr>
+            <w:r/>
+            <w:r>
+              <w:rPr>
+                <w:sz w:val="21"/>
+              </w:rPr>
+              <w:t>48%</w:t>
+            </w:r>
+          </w:p>
+        </w:tc>
+      </w:tr>
+      <w:tr>
+        <w:trPr>
+          <w:cantSplit w:val="true"/>
+        </w:trPr>
+        <w:tc>
+          <w:tcPr>
+            <w:tcW w:type="dxa" w:w="2381"/>
+          </w:tcPr>
+          <w:p>
+            <w:pPr>
+              <w:spacing w:after="20" w:line="264" w:lineRule="auto"/>
+              <w:jc w:val="left"/>
+            </w:pPr>
+            <w:r>
+              <w:rPr>
+                <w:b/>
+              </w:rPr>
+            </w:r>
+            <w:r>
+              <w:rPr>
+                <w:b/>
+                <w:sz w:val="21"/>
+              </w:rPr>
+              <w:t>Faithfulness</w:t>
+            </w:r>
+          </w:p>
+        </w:tc>
+        <w:tc>
+          <w:tcPr>
+            <w:tcW w:type="dxa" w:w="2608"/>
+          </w:tcPr>
+          <w:p>
+            <w:pPr>
+              <w:spacing w:after="20" w:line="264" w:lineRule="auto"/>
+              <w:jc w:val="left"/>
+            </w:pPr>
+            <w:r/>
+            <w:r>
+              <w:rPr>
+                <w:sz w:val="21"/>
+              </w:rPr>
+              <w:t>GraphRAG</w:t>
+            </w:r>
+          </w:p>
+        </w:tc>
+        <w:tc>
+          <w:tcPr>
+            <w:tcW w:type="dxa" w:w="1701"/>
+          </w:tcPr>
+          <w:p>
+            <w:pPr>
+              <w:spacing w:after="20" w:line="264" w:lineRule="auto"/>
+              <w:jc w:val="center"/>
+            </w:pPr>
+            <w:r/>
+            <w:r>
+              <w:rPr>
+                <w:sz w:val="21"/>
+              </w:rPr>
+              <w:t>0,991</w:t>
+            </w:r>
+          </w:p>
+        </w:tc>
+        <w:tc>
+          <w:tcPr>
+            <w:tcW w:type="dxa" w:w="1701"/>
+          </w:tcPr>
+          <w:p>
+            <w:pPr>
+              <w:spacing w:after="20" w:line="264" w:lineRule="auto"/>
+              <w:jc w:val="center"/>
+            </w:pPr>
+            <w:r/>
+            <w:r>
+              <w:rPr>
+                <w:sz w:val="21"/>
+              </w:rPr>
+              <w:t>0,838</w:t>
+            </w:r>
+          </w:p>
+        </w:tc>
+      </w:tr>
+      <w:tr>
+        <w:trPr>
+          <w:cantSplit w:val="true"/>
+        </w:trPr>
+        <w:tc>
+          <w:tcPr>
+            <w:tcW w:type="dxa" w:w="2381"/>
+            <w:shd w:val="clear" w:color="auto" w:fill="F0F5FC"/>
+          </w:tcPr>
+          <w:p>
+            <w:pPr>
+              <w:spacing w:after="20" w:line="264" w:lineRule="auto"/>
+              <w:jc w:val="left"/>
+            </w:pPr>
+            <w:r>
+              <w:rPr>
+                <w:b/>
+              </w:rPr>
+            </w:r>
+          </w:p>
+        </w:tc>
+        <w:tc>
+          <w:tcPr>
+            <w:tcW w:type="dxa" w:w="2608"/>
+            <w:shd w:val="clear" w:color="auto" w:fill="F0F5FC"/>
+          </w:tcPr>
+          <w:p>
+            <w:pPr>
+              <w:spacing w:after="20" w:line="264" w:lineRule="auto"/>
+              <w:jc w:val="left"/>
+            </w:pPr>
+            <w:r/>
+            <w:r>
+              <w:rPr>
+                <w:sz w:val="21"/>
+              </w:rPr>
+              <w:t>Vector RAG</w:t>
+            </w:r>
+          </w:p>
+        </w:tc>
+        <w:tc>
+          <w:tcPr>
+            <w:tcW w:type="dxa" w:w="1701"/>
+            <w:shd w:val="clear" w:color="auto" w:fill="F0F5FC"/>
+          </w:tcPr>
+          <w:p>
+            <w:pPr>
+              <w:spacing w:after="20" w:line="264" w:lineRule="auto"/>
+              <w:jc w:val="center"/>
+            </w:pPr>
+            <w:r/>
+            <w:r>
+              <w:rPr>
+                <w:sz w:val="21"/>
+              </w:rPr>
+              <w:t>0,933</w:t>
+            </w:r>
+          </w:p>
+        </w:tc>
+        <w:tc>
+          <w:tcPr>
+            <w:tcW w:type="dxa" w:w="1701"/>
+            <w:shd w:val="clear" w:color="auto" w:fill="F0F5FC"/>
+          </w:tcPr>
+          <w:p>
+            <w:pPr>
+              <w:spacing w:after="20" w:line="264" w:lineRule="auto"/>
+              <w:jc w:val="center"/>
+            </w:pPr>
+            <w:r/>
+            <w:r>
+              <w:rPr>
+                <w:sz w:val="21"/>
+              </w:rPr>
+              <w:t>0,899</w:t>
+            </w:r>
+          </w:p>
+        </w:tc>
+      </w:tr>
+    </w:tbl>
+    <w:p>
+      <w:pPr>
+        <w:spacing w:after="40"/>
+      </w:pPr>
+    </w:p>
+    <w:p>
+      <w:pPr>
+        <w:ind w:firstLine="567"/>
+      </w:pPr>
+      <w:r>
+        <w:t>Phân tích các nhãn bị lệch cho thấy ba nguyên nhân, mỗi nguyên nhân gắn với một prompt của judge:</w:t>
+      </w:r>
+    </w:p>
+    <w:p>
+      <w:pPr>
+        <w:pStyle w:val="ListBullet"/>
+        <w:spacing w:after="60"/>
+      </w:pPr>
+      <w:r>
+        <w:rPr>
+          <w:b/>
+        </w:rPr>
+        <w:t xml:space="preserve">Answer correctness, judge chỉ cần đúng chủ đề: </w:t>
+      </w:r>
+      <w:r>
+        <w:t>16 trên 17 câu trả lời bị lệch là judge chấm đúng còn human judge chấm sai, trong đó 13 câu multi-hop. Ground truth của câu multi-hop ghép từ hai đoạn văn và thường gồm 4–6 ý; câu trả lời hay chỉ nêu được phần đầu. Prompt chỉ yêu cầu "conveys the key facts of the reference without contradicting it", và judge 8B chấm 1 khi câu trả lời cùng chủ đề, dùng cùng thuật ngữ mà không đối chiếu từng ý; có câu ghi khoá công khai Kyber khoảng 1088 byte trong khi ground truth ghi khoảng 800 byte vẫn được chấm đúng. Human judge chỉ chấm đúng khi câu trả lời nêu đủ các ý chính, nên ở câu multi-hop hai bên lệch nhiều nhất (22% so với 94%).</w:t>
+      </w:r>
+    </w:p>
+    <w:p>
+      <w:pPr>
+        <w:pStyle w:val="ListBullet"/>
+        <w:spacing w:after="60"/>
+      </w:pPr>
+      <w:r>
+        <w:rPr>
+          <w:b/>
+        </w:rPr>
+        <w:t xml:space="preserve">Passage hữu ích, judge gần như không phân biệt: </w:t>
+      </w:r>
+      <w:r>
+        <w:t>54 passage judge chấm hữu ích mà human judge không, chiều ngược lại chỉ 9. Tỉ lệ judge chấm hữu ích bằng nhau ở hai hệ (51,4%) và gần như không đổi theo vị trí xếp hạng, trong khi human judge thấy passage xếp hạng 1 hữu ích nhiều hơn hẳn các passage sau và GraphRAG kém hơn Vector RAG. Dù prompt dặn passage chỉ cùng chủ đề thì là "no", judge vẫn thiên về "yes" khi phải chấm 4 passage dài trong một lần gọi.</w:t>
+      </w:r>
+    </w:p>
+    <w:p>
+      <w:pPr>
+        <w:pStyle w:val="ListBullet"/>
+        <w:spacing w:after="60"/>
+      </w:pPr>
+      <w:r>
+        <w:rPr>
+          <w:b/>
+        </w:rPr>
+        <w:t xml:space="preserve">Verify claim, judge khắt khe với context dài: </w:t>
+      </w:r>
+      <w:r>
+        <w:t>ngược với hai prompt trên, ở bước verify claim judge chấm 12 câu trả lời có claim không được hỗ trợ mà human judge thấy đủ, không có trường hợp ngược lại; 9 câu trong số đó là của GraphRAG. Context của GraphRAG gồm cả mô tả KG lẫn 4 passage nên dài hơn, còn prompt yêu cầu judge là "strict fact checker" và chỉ trả lời "yes" khi claim "directly inferred" từ context; claim diễn đạt lại ý hoặc dựa trên một dòng mô tả KG ngắn dễ bị chấm "no". Vì vậy faithfulness của GraphRAG bị judge chấm thấp hơn nhiều so với human judge (0,838 so với 0,991), còn ở Vector RAG chênh lệch nhỏ.</w:t>
+      </w:r>
+    </w:p>
+    <w:p>
+      <w:pPr>
+        <w:ind w:firstLine="567"/>
+      </w:pPr>
+      <w:r>
+        <w:t>Như vậy mức tuyệt đối của các metric do judge chấm (Bảng 7) không nên đọc như độ chính xác thực của hệ thống; theo nhãn human judge, answer correctness trên mẫu này thấp hơn khoảng một nửa. Paired difference giữa hai hệ do cùng một judge chấm bù trừ được một phần sai lệch chung, nhưng không hết khi sai lệch khác nhau giữa hai hệ, như ở faithfulness của GraphRAG.</w:t>
+      </w:r>
+    </w:p>
+    <w:p>
+      <w:pPr>
+        <w:pStyle w:val="Caption"/>
+        <w:keepNext/>
+        <w:jc w:val="center"/>
+      </w:pPr>
+      <w:r>
+        <w:t>Bảng 12. GraphRAG − Vector RAG trên cùng mẫu, tính bằng nhãn human judge và nhãn judge (in đậm: có statistical significance)</w:t>
       </w:r>
     </w:p>
     <w:tbl>

</xml_diff>

<commit_message>
Kiểm tra tay KG (nội dung 3), chấm tay cặp context gốc / nén (nội dung 4) và khuyến nghị triển khai
- Nội dung 3: duyệt lại 20% gold set, kiểm tra tay 40 edge mỗi KG10 / KG20, fact retention kiểu MINE
  (262 sự kiện, hiệu chỉnh theo 60 cặp chấm tay); relation completeness hiệu chỉnh theo kiểm tra tay của từng KG
- Nội dung 4: chấm tay 30 cặp câu trả lời context gốc / nén cả hai (claim, ý bắt buộc của ground truth),
  kiểm tra thiên lệch của judge theo độ dài context; mục 5.7 và phần đối chiếu tài liệu của báo cáo Y4
- Nội dung 2: bỏ cặp thiếu điểm khi tính paired retrieval precision; ghi rõ lý do bổ sung 7 bài
- Tổng hợp Y1–Y4 kèm mục khuyến nghị triển khai (report/build_tonghop.py)
</commit_message>
<xml_diff>
--- a/report/Bao_cao_Y2.docx
+++ b/report/Bao_cao_Y2.docx
@@ -1226,7 +1226,7 @@
         <w:ind w:firstLine="567"/>
       </w:pPr>
       <w:r>
-        <w:t>Corpus chỉ có 23 bài thuộc nhóm quantum (17 Quantum Security, 6 Quantum Machine Learning) và không có chủ đề thứ ba nào đủ gần (độ tương đồng thuật ngữ với nhóm quantum thấp hơn khoảng 10 lần so với giữa các bài quantum). Vì vậy bổ sung 7 bài truy cập mở trên arXiv, là bài gốc của những khái niệm mà 23 bài kia nhắc tới nhiều nhất, để đủ 30 bài cùng một chủ đề:</w:t>
+        <w:t>Tập bài báo được giao có nhiều bài trùng nhau; sau khi loại bài trùng, corpus còn 95 bài và chỉ 23 bài thuộc nhóm quantum (17 Quantum Security, 6 Quantum Machine Learning). Không có chủ đề thứ ba nào đủ gần để ghép thêm (độ tương đồng thuật ngữ với nhóm quantum thấp hơn khoảng 10 lần so với giữa các bài quantum). Vì vậy bổ sung 7 bài truy cập mở trên arXiv, là bài gốc của những khái niệm mà 23 bài kia nhắc tới nhiều nhất, để đủ 30 bài cùng một chủ đề:</w:t>
       </w:r>
     </w:p>
     <w:p>
@@ -6664,7 +6664,7 @@
         <w:t>Theo nhóm bài nguồn:</w:t>
       </w:r>
       <w:r>
-        <w:t xml:space="preserve"> 7/30 bài là bài bổ sung (bài gốc của các khái niệm mà 23 bài còn lại nhắc nhiều nhất, mục 3), nên tập 30 bài không phải mẫu ngẫu nhiên và các bài bổ sung có thể làm KG liên kết tốt hơn. Tách theo nhóm: ở 52 câu chỉ dùng 23 bài thuộc corpus ban đầu, retrieval precision của GraphRAG vẫn thấp hơn Vector RAG (0,50 so với 0,66, chênh lệch +nan [+nan; +nan]) và tỉ lệ lấy được gold chunk là 38% so với 67%; ở 10 câu có bài nguồn thuộc 7 bài bổ sung, tỉ lệ lấy được gold chunk là 40% so với 75% (quá ít câu để kiểm định). Như vậy kết luận về truy xuất không đến từ các bài bổ sung, và GraphRAG cũng không truy xuất tốt hơn ở nhóm bài kinh điển này.</w:t>
+        <w:t xml:space="preserve"> 7/30 bài là bài bổ sung (bài gốc của các khái niệm mà 23 bài còn lại nhắc nhiều nhất, mục 3), nên tập 30 bài không phải mẫu ngẫu nhiên và các bài bổ sung có thể làm KG liên kết tốt hơn. Tách theo nhóm: ở 52 câu chỉ dùng 23 bài thuộc corpus ban đầu, retrieval precision của GraphRAG vẫn thấp hơn Vector RAG (0,50 so với 0,66, chênh lệch −0,165 [−0,247; −0,085], n = 49 cặp) và tỉ lệ lấy được gold chunk là 38% so với 67%; ở 10 câu có bài nguồn thuộc 7 bài bổ sung, tỉ lệ lấy được gold chunk là 40% so với 75% (quá ít câu để kiểm định). Như vậy kết luận về truy xuất không đến từ các bài bổ sung, và GraphRAG cũng không truy xuất tốt hơn ở nhóm bài kinh điển này.</w:t>
       </w:r>
     </w:p>
     <w:p>

</xml_diff>